<commit_message>
docs: release v1.0 documentation with stand address and current measurements
</commit_message>
<xml_diff>
--- a/output/documentation-2026-09-28/00_Ведомость_документов.docx
+++ b/output/documentation-2026-09-28/00_Ведомость_документов.docx
@@ -48,7 +48,7 @@
         <w:jc w:val="center"/>
       </w:pPr>
       <w:r>
-        <w:t>Программная версия 9fb10f8</w:t>
+        <w:t>Программная версия v1.0</w:t>
       </w:r>
     </w:p>
     <w:p>
@@ -134,7 +134,7 @@
     </w:p>
     <w:p>
       <w:r>
-        <w:t>Ведомость описывает документацию проекта 112 AI Trainer версии 9fb10f8. В комплект входят описание программы, инструкции настройки и работы, технологии, показатели производительности, безопасность и программа испытаний.</w:t>
+        <w:t>Ведомость описывает документацию проекта 112 AI Trainer версии v1.0. В комплект входят описание программы, инструкции настройки и работы, технологии, показатели производительности, безопасность и программа испытаний.</w:t>
       </w:r>
     </w:p>
     <w:p>
@@ -1373,7 +1373,7 @@
     </w:p>
     <w:p>
       <w:r>
-        <w:t>ТЗ ДГОЧСиПБ от 01.09.2026; предоставленные памятки и изображения АРМ; текст Q&amp;A «Город 9. Департамент по делам гражданской обороны»; сообщения заказчика от 21.09.2026; исходники версии 9fb10f8; протоколы CPU и SIP от 27.09.2026.</w:t>
+        <w:t>ТЗ ДГОЧСиПБ от 01.09.2026; предоставленные памятки и изображения АРМ; текст Q&amp;A «Город 9. Департамент по делам гражданской обороны»; сообщения заказчика от 21.09.2026; исходники версии v1.0; протоколы CPU и SIP от 27.09.2026.</w:t>
       </w:r>
     </w:p>
     <w:p>

</xml_diff>